<commit_message>
Fix anchor argument: tendero already has Trululu regular, not Estelar
https://claude.ai/code/session_01PrFk86kPeBwzM2SyiU2b4D
</commit_message>
<xml_diff>
--- a/Caso3_Oferta_Edicion_Estelar_v2.docx
+++ b/Caso3_Oferta_Edicion_Estelar_v2.docx
@@ -343,7 +343,7 @@
           <w:color w:val="FFFFFF"/>
           <w:sz w:val="21"/>
         </w:rPr>
-        <w:t xml:space="preserve">  "Tus clientes ya piden Trululu — Edición Estelar solo hay que ponerla donde la vean. No te pido que la vendas: te pido que la pongas. Con 48 unidades y la bonificación incluida, recuperas tu inversión antes de que se acabe la semana. Y el que no la tenga... le regala la venta al de enfrente."</w:t>
+        <w:t xml:space="preserve">  "Tus clientes ya te compran Trululu — eso significa que confían en ti para la categoría. Edición Estelar es la nueva referencia especial que ellos van a empezar a buscar. Si no la tienes, no pierden la compra de Trululu regular — pero salen a buscar la Estelar a otra tienda. Y cuando encuentran la Estelar allá... pueden quedarse comprando todo allá."</w:t>
       </w:r>
     </w:p>
     <w:p>
@@ -359,7 +359,7 @@
           <w:color w:val="1C1C1C"/>
           <w:sz w:val="20"/>
         </w:rPr>
-        <w:t>▸  La clave del argumento es el riesgo de oportunidad, no el beneficio del producto. Al tendero le duele más perder una venta que ganar un bono.</w:t>
+        <w:t>▸  El argumento no amenaza la venta actual de Trululu — la respeta. Lo que señala es el riesgo de ceder tráfico de un cliente fiel a la competencia por no tener una referencia que sí es fácil de conseguir.</w:t>
       </w:r>
     </w:p>
     <w:p>

</xml_diff>